<commit_message>
Files changed added resume
</commit_message>
<xml_diff>
--- a/public/Sayan_Banerjee_IEM2027.docx
+++ b/public/Sayan_Banerjee_IEM2027.docx
@@ -155,6 +155,7 @@
           <w:szCs w:val="16"/>
         </w:rPr>
       </w:pPr>
+      <w:proofErr w:type="gramStart"/>
       <w:r>
         <w:rPr>
           <w:rFonts w:ascii="Arial" w:eastAsia="Arial" w:hAnsi="Arial" w:cs="Arial"/>
@@ -173,6 +174,7 @@
         </w:rPr>
         <w:t>:</w:t>
       </w:r>
+      <w:proofErr w:type="gramEnd"/>
       <w:r>
         <w:rPr>
           <w:rFonts w:ascii="Arial" w:eastAsia="Arial" w:hAnsi="Arial" w:cs="Arial"/>
@@ -612,7 +614,27 @@
           <w:sz w:val="16"/>
           <w:szCs w:val="16"/>
         </w:rPr>
-        <w:t>I.S.C, Percentage : 85.2 %</w:t>
+        <w:t xml:space="preserve">I.S.C, </w:t>
+      </w:r>
+      <w:proofErr w:type="gramStart"/>
+      <w:r>
+        <w:rPr>
+          <w:rFonts w:ascii="Arial" w:eastAsia="Arial" w:hAnsi="Arial" w:cs="Arial"/>
+          <w:i w:val="0"/>
+          <w:sz w:val="16"/>
+          <w:szCs w:val="16"/>
+        </w:rPr>
+        <w:t>Percentage :</w:t>
+      </w:r>
+      <w:proofErr w:type="gramEnd"/>
+      <w:r>
+        <w:rPr>
+          <w:rFonts w:ascii="Arial" w:eastAsia="Arial" w:hAnsi="Arial" w:cs="Arial"/>
+          <w:i w:val="0"/>
+          <w:sz w:val="16"/>
+          <w:szCs w:val="16"/>
+        </w:rPr>
+        <w:t xml:space="preserve"> 85.2 %</w:t>
       </w:r>
       <w:r>
         <w:rPr>
@@ -771,7 +793,27 @@
           <w:sz w:val="16"/>
           <w:szCs w:val="16"/>
         </w:rPr>
-        <w:t>I.C.S.E., Percentage : 85.6%</w:t>
+        <w:t xml:space="preserve">I.C.S.E., </w:t>
+      </w:r>
+      <w:proofErr w:type="gramStart"/>
+      <w:r>
+        <w:rPr>
+          <w:rFonts w:ascii="Arial" w:eastAsia="Arial" w:hAnsi="Arial" w:cs="Arial"/>
+          <w:i w:val="0"/>
+          <w:sz w:val="16"/>
+          <w:szCs w:val="16"/>
+        </w:rPr>
+        <w:t>Percentage :</w:t>
+      </w:r>
+      <w:proofErr w:type="gramEnd"/>
+      <w:r>
+        <w:rPr>
+          <w:rFonts w:ascii="Arial" w:eastAsia="Arial" w:hAnsi="Arial" w:cs="Arial"/>
+          <w:i w:val="0"/>
+          <w:sz w:val="16"/>
+          <w:szCs w:val="16"/>
+        </w:rPr>
+        <w:t xml:space="preserve"> 85.6%</w:t>
       </w:r>
       <w:r>
         <w:rPr>
@@ -1195,6 +1237,8 @@
         <w:ind w:right="-135" w:hanging="190"/>
         <w:rPr>
           <w:rFonts w:ascii="Arial MT" w:eastAsia="Arial MT" w:hAnsi="Arial MT" w:cs="Arial MT"/>
+          <w:b/>
+          <w:bCs/>
           <w:color w:val="000000"/>
           <w:sz w:val="16"/>
           <w:szCs w:val="16"/>
@@ -1244,16 +1288,7 @@
           <w:sz w:val="16"/>
           <w:szCs w:val="16"/>
         </w:rPr>
-        <w:t>Spring Boot</w:t>
-      </w:r>
-      <w:r>
-        <w:rPr>
-          <w:rFonts w:ascii="Arial" w:eastAsia="Arial" w:hAnsi="Arial" w:cs="Arial"/>
-          <w:color w:val="000000"/>
-          <w:sz w:val="16"/>
-          <w:szCs w:val="16"/>
-        </w:rPr>
-        <w:t xml:space="preserve"> Fundamentals</w:t>
+        <w:t>Spring Boot (Layered Architecture, RESTful APIs), JWT Authentication, Validation &amp; Exception Handling</w:t>
       </w:r>
     </w:p>
     <w:p>
@@ -1326,22 +1361,13 @@
         <w:ind w:right="-135" w:hanging="190"/>
         <w:rPr>
           <w:rFonts w:ascii="Arial MT" w:eastAsia="Arial MT" w:hAnsi="Arial MT" w:cs="Arial MT"/>
-          <w:color w:val="000000"/>
-          <w:sz w:val="16"/>
-          <w:szCs w:val="16"/>
-        </w:rPr>
-      </w:pPr>
-      <w:r>
-        <w:rPr>
-          <w:rFonts w:ascii="Arial MT" w:eastAsia="Arial MT" w:hAnsi="Arial MT" w:cs="Arial MT"/>
           <w:b/>
           <w:bCs/>
           <w:color w:val="000000"/>
           <w:sz w:val="16"/>
           <w:szCs w:val="16"/>
         </w:rPr>
-        <w:t>Cloud Service:</w:t>
-      </w:r>
+      </w:pPr>
       <w:r>
         <w:rPr>
           <w:rFonts w:ascii="Arial MT" w:eastAsia="Arial MT" w:hAnsi="Arial MT" w:cs="Arial MT"/>
@@ -1351,7 +1377,18 @@
           <w:sz w:val="16"/>
           <w:szCs w:val="16"/>
         </w:rPr>
-        <w:t xml:space="preserve">    </w:t>
+        <w:t>DevOps &amp; Deployment:</w:t>
+      </w:r>
+      <w:r>
+        <w:rPr>
+          <w:rFonts w:ascii="Arial MT" w:eastAsia="Arial MT" w:hAnsi="Arial MT" w:cs="Arial MT"/>
+          <w:b/>
+          <w:bCs/>
+          <w:color w:val="000000"/>
+          <w:sz w:val="16"/>
+          <w:szCs w:val="16"/>
+        </w:rPr>
+        <w:t xml:space="preserve">  </w:t>
       </w:r>
       <w:r>
         <w:rPr>
@@ -1360,16 +1397,7 @@
           <w:sz w:val="16"/>
           <w:szCs w:val="16"/>
         </w:rPr>
-        <w:t xml:space="preserve">Amazon Web Services </w:t>
-      </w:r>
-      <w:r>
-        <w:rPr>
-          <w:rFonts w:ascii="Arial MT" w:eastAsia="Arial MT" w:hAnsi="Arial MT" w:cs="Arial MT"/>
-          <w:color w:val="000000"/>
-          <w:sz w:val="16"/>
-          <w:szCs w:val="16"/>
-        </w:rPr>
-        <w:t>Foundations</w:t>
+        <w:t>Docker (Containerization), Git, GitHub, CI/CD Fundamentals</w:t>
       </w:r>
     </w:p>
     <w:p>
@@ -1400,40 +1428,34 @@
       </w:pPr>
       <w:r>
         <w:rPr>
-          <w:rFonts w:ascii="Arial" w:eastAsia="Arial" w:hAnsi="Arial" w:cs="Arial"/>
-          <w:b/>
+          <w:rFonts w:ascii="Arial MT" w:eastAsia="Arial MT" w:hAnsi="Arial MT" w:cs="Arial MT"/>
+          <w:b/>
+          <w:bCs/>
           <w:color w:val="000000"/>
           <w:sz w:val="16"/>
           <w:szCs w:val="16"/>
         </w:rPr>
-        <w:t>Tools</w:t>
-      </w:r>
-      <w:r>
-        <w:rPr>
-          <w:rFonts w:ascii="Arial" w:eastAsia="Arial" w:hAnsi="Arial" w:cs="Arial"/>
+        <w:t>Cloud Service:</w:t>
+      </w:r>
+      <w:r>
+        <w:rPr>
+          <w:rFonts w:ascii="Arial MT" w:eastAsia="Arial MT" w:hAnsi="Arial MT" w:cs="Arial MT"/>
+          <w:b/>
+          <w:bCs/>
           <w:color w:val="000000"/>
           <w:sz w:val="16"/>
           <w:szCs w:val="16"/>
         </w:rPr>
-        <w:t>:</w:t>
-      </w:r>
-      <w:r>
-        <w:rPr>
-          <w:rFonts w:ascii="Arial" w:eastAsia="Arial" w:hAnsi="Arial" w:cs="Arial"/>
+        <w:t xml:space="preserve">    </w:t>
+      </w:r>
+      <w:r>
+        <w:rPr>
+          <w:rFonts w:ascii="Arial MT" w:eastAsia="Arial MT" w:hAnsi="Arial MT" w:cs="Arial MT"/>
           <w:color w:val="000000"/>
           <w:sz w:val="16"/>
           <w:szCs w:val="16"/>
         </w:rPr>
-        <w:t xml:space="preserve">                  </w:t>
-      </w:r>
-      <w:r>
-        <w:rPr>
-          <w:rFonts w:ascii="Arial" w:eastAsia="Arial" w:hAnsi="Arial" w:cs="Arial"/>
-          <w:color w:val="000000"/>
-          <w:sz w:val="16"/>
-          <w:szCs w:val="16"/>
-        </w:rPr>
-        <w:t>Git, GitHub, Docker</w:t>
+        <w:t>AWS (Amplify Deployment, Cloud Fundamentals)</w:t>
       </w:r>
     </w:p>
     <w:p>
@@ -1466,33 +1488,27 @@
         <w:rPr>
           <w:rFonts w:ascii="Arial" w:eastAsia="Arial" w:hAnsi="Arial" w:cs="Arial"/>
           <w:b/>
+          <w:bCs/>
           <w:color w:val="000000"/>
           <w:sz w:val="16"/>
           <w:szCs w:val="16"/>
         </w:rPr>
-        <w:t>Platforms</w:t>
-      </w:r>
-      <w:r>
-        <w:rPr>
-          <w:rFonts w:ascii="Arial" w:eastAsia="Arial" w:hAnsi="Arial" w:cs="Arial"/>
+        <w:t>Tools:</w:t>
+      </w:r>
+      <w:r>
+        <w:rPr>
+          <w:rFonts w:ascii="Arial" w:eastAsia="Arial" w:hAnsi="Arial" w:cs="Arial"/>
+          <w:b/>
           <w:color w:val="000000"/>
           <w:sz w:val="16"/>
           <w:szCs w:val="16"/>
         </w:rPr>
-        <w:t>:</w:t>
-      </w:r>
-      <w:r>
-        <w:rPr>
-          <w:rFonts w:ascii="Arial" w:eastAsia="Arial" w:hAnsi="Arial" w:cs="Arial"/>
-          <w:color w:val="000000"/>
-          <w:sz w:val="16"/>
-          <w:szCs w:val="16"/>
-        </w:rPr>
-        <w:t xml:space="preserve">           </w:t>
-      </w:r>
-      <w:r>
-        <w:rPr>
-          <w:rFonts w:ascii="Arial" w:eastAsia="Arial" w:hAnsi="Arial" w:cs="Arial"/>
+        <w:t xml:space="preserve">                  </w:t>
+      </w:r>
+      <w:r>
+        <w:rPr>
+          <w:rFonts w:ascii="Arial" w:eastAsia="Arial" w:hAnsi="Arial" w:cs="Arial"/>
+          <w:bCs/>
           <w:color w:val="000000"/>
           <w:sz w:val="16"/>
           <w:szCs w:val="16"/>
@@ -1515,45 +1531,46 @@
         </w:pBdr>
         <w:tabs>
           <w:tab w:val="left" w:pos="434"/>
-          <w:tab w:val="left" w:pos="1907"/>
-        </w:tabs>
-        <w:spacing w:before="49" w:line="276" w:lineRule="auto"/>
+          <w:tab w:val="left" w:pos="1933"/>
+        </w:tabs>
+        <w:spacing w:before="47" w:line="276" w:lineRule="auto"/>
         <w:ind w:right="-135"/>
+        <w:rPr>
+          <w:rFonts w:ascii="Arial" w:eastAsia="Arial" w:hAnsi="Arial" w:cs="Arial"/>
+          <w:sz w:val="16"/>
+          <w:szCs w:val="16"/>
+        </w:rPr>
+      </w:pPr>
+      <w:r>
+        <w:rPr>
+          <w:rFonts w:ascii="Arial MT" w:eastAsia="Arial MT" w:hAnsi="Arial MT" w:cs="Arial MT"/>
+          <w:b/>
+          <w:bCs/>
+          <w:color w:val="000000"/>
+          <w:sz w:val="16"/>
+          <w:szCs w:val="16"/>
+        </w:rPr>
+        <w:t>Core Concepts:</w:t>
+      </w:r>
+      <w:r>
+        <w:rPr>
+          <w:rFonts w:ascii="Arial MT" w:eastAsia="Arial MT" w:hAnsi="Arial MT" w:cs="Arial MT"/>
+          <w:b/>
+          <w:bCs/>
+          <w:color w:val="000000"/>
+          <w:sz w:val="16"/>
+          <w:szCs w:val="16"/>
+        </w:rPr>
+        <w:t xml:space="preserve">  </w:t>
+      </w:r>
+      <w:r>
         <w:rPr>
           <w:rFonts w:ascii="Arial MT" w:eastAsia="Arial MT" w:hAnsi="Arial MT" w:cs="Arial MT"/>
           <w:color w:val="000000"/>
           <w:sz w:val="16"/>
           <w:szCs w:val="16"/>
         </w:rPr>
-      </w:pPr>
-      <w:r>
-        <w:rPr>
-          <w:rFonts w:ascii="Arial MT" w:eastAsia="Arial MT" w:hAnsi="Arial MT" w:cs="Arial MT"/>
-          <w:b/>
-          <w:bCs/>
-          <w:color w:val="000000"/>
-          <w:sz w:val="16"/>
-          <w:szCs w:val="16"/>
-        </w:rPr>
-        <w:t>Other / Concepts</w:t>
-      </w:r>
-      <w:r>
-        <w:rPr>
-          <w:rFonts w:ascii="Arial MT" w:eastAsia="Arial MT" w:hAnsi="Arial MT" w:cs="Arial MT"/>
-          <w:color w:val="000000"/>
-          <w:sz w:val="16"/>
-          <w:szCs w:val="16"/>
-        </w:rPr>
-        <w:t>:  RESTful API Design, Object-Oriented Programming (OOP), Data Structures Fundamentals, JWT-based Authentication, CI/CD Fundamentals</w:t>
-      </w:r>
-      <w:r>
-        <w:rPr>
-          <w:rFonts w:ascii="Arial MT" w:eastAsia="Arial MT" w:hAnsi="Arial MT" w:cs="Arial MT"/>
-          <w:color w:val="000000"/>
-          <w:sz w:val="16"/>
-          <w:szCs w:val="16"/>
-        </w:rPr>
-        <w:t>, System Design Fundamentals</w:t>
+        <w:t>Object-Oriented Programming (OOP), Data Structures &amp; Algorithms, REST API Design, System Design Basics</w:t>
       </w:r>
     </w:p>
     <w:p>
@@ -2477,70 +2494,6 @@
     </w:p>
     <w:p>
       <w:pPr>
-        <w:tabs>
-          <w:tab w:val="left" w:pos="874"/>
-        </w:tabs>
-        <w:spacing w:before="28" w:line="276" w:lineRule="auto"/>
-        <w:ind w:left="681" w:right="-135"/>
-        <w:rPr>
-          <w:rFonts w:ascii="Arial" w:eastAsia="Arial" w:hAnsi="Arial" w:cs="Arial"/>
-          <w:sz w:val="16"/>
-          <w:szCs w:val="16"/>
-        </w:rPr>
-      </w:pPr>
-    </w:p>
-    <w:p>
-      <w:pPr>
-        <w:pStyle w:val="Heading4"/>
-        <w:tabs>
-          <w:tab w:val="left" w:pos="434"/>
-        </w:tabs>
-        <w:spacing w:before="22" w:line="276" w:lineRule="auto"/>
-        <w:ind w:left="0" w:right="-135" w:firstLine="0"/>
-        <w:rPr>
-          <w:rFonts w:ascii="Arial" w:eastAsia="Arial" w:hAnsi="Arial" w:cs="Arial"/>
-          <w:sz w:val="16"/>
-          <w:szCs w:val="16"/>
-        </w:rPr>
-      </w:pPr>
-      <w:r>
-        <w:rPr>
-          <w:rFonts w:ascii="Arial" w:eastAsia="Arial" w:hAnsi="Arial" w:cs="Arial"/>
-          <w:sz w:val="16"/>
-          <w:szCs w:val="16"/>
-        </w:rPr>
-        <w:t>Phishing Link and Email Detector |</w:t>
-      </w:r>
-      <w:r>
-        <w:t xml:space="preserve">                                                                                      </w:t>
-      </w:r>
-      <w:r>
-        <w:rPr>
-          <w:rFonts w:ascii="Arial" w:eastAsia="Arial" w:hAnsi="Arial" w:cs="Arial"/>
-          <w:sz w:val="16"/>
-          <w:szCs w:val="16"/>
-        </w:rPr>
-        <w:t xml:space="preserve">                                                   </w:t>
-      </w:r>
-      <w:r>
-        <w:rPr>
-          <w:rFonts w:ascii="Arial" w:eastAsia="Arial" w:hAnsi="Arial" w:cs="Arial"/>
-          <w:sz w:val="16"/>
-          <w:szCs w:val="16"/>
-        </w:rPr>
-        <w:t xml:space="preserve"> </w:t>
-      </w:r>
-      <w:r>
-        <w:rPr>
-          <w:rFonts w:ascii="Arial" w:eastAsia="Arial" w:hAnsi="Arial" w:cs="Arial"/>
-          <w:sz w:val="16"/>
-          <w:szCs w:val="16"/>
-        </w:rPr>
-        <w:t>December 2025 – January 2026</w:t>
-      </w:r>
-    </w:p>
-    <w:p>
-      <w:pPr>
         <w:numPr>
           <w:ilvl w:val="1"/>
           <w:numId w:val="1"/>
@@ -2548,7 +2501,7 @@
         <w:tabs>
           <w:tab w:val="left" w:pos="874"/>
         </w:tabs>
-        <w:spacing w:before="26" w:line="276" w:lineRule="auto"/>
+        <w:spacing w:before="28" w:line="276" w:lineRule="auto"/>
         <w:ind w:right="-135"/>
         <w:rPr>
           <w:rFonts w:ascii="Arial" w:eastAsia="Arial" w:hAnsi="Arial" w:cs="Arial"/>
@@ -2562,7 +2515,124 @@
           <w:sz w:val="16"/>
           <w:szCs w:val="16"/>
         </w:rPr>
-        <w:t>Developed a web-based application to detect and flag phishing links and fraudulent emails, enhancing user awareness and online security.</w:t>
+        <w:t>Tested APIs using Postman and validated request-response flows.</w:t>
+      </w:r>
+    </w:p>
+    <w:p>
+      <w:pPr>
+        <w:tabs>
+          <w:tab w:val="left" w:pos="874"/>
+        </w:tabs>
+        <w:spacing w:before="28" w:line="276" w:lineRule="auto"/>
+        <w:ind w:left="681" w:right="-135"/>
+        <w:rPr>
+          <w:rFonts w:ascii="Arial" w:eastAsia="Arial" w:hAnsi="Arial" w:cs="Arial"/>
+          <w:sz w:val="16"/>
+          <w:szCs w:val="16"/>
+        </w:rPr>
+      </w:pPr>
+    </w:p>
+    <w:p>
+      <w:pPr>
+        <w:pStyle w:val="Heading4"/>
+        <w:tabs>
+          <w:tab w:val="left" w:pos="434"/>
+        </w:tabs>
+        <w:spacing w:before="22" w:line="276" w:lineRule="auto"/>
+        <w:ind w:left="0" w:right="-135" w:firstLine="0"/>
+      </w:pPr>
+      <w:proofErr w:type="spellStart"/>
+      <w:r>
+        <w:rPr>
+          <w:rFonts w:ascii="Arial" w:eastAsia="Arial" w:hAnsi="Arial" w:cs="Arial"/>
+          <w:sz w:val="16"/>
+          <w:szCs w:val="16"/>
+        </w:rPr>
+        <w:t>Url</w:t>
+      </w:r>
+      <w:proofErr w:type="spellEnd"/>
+      <w:r>
+        <w:rPr>
+          <w:rFonts w:ascii="Arial" w:eastAsia="Arial" w:hAnsi="Arial" w:cs="Arial"/>
+          <w:sz w:val="16"/>
+          <w:szCs w:val="16"/>
+        </w:rPr>
+        <w:t xml:space="preserve"> Shortener</w:t>
+      </w:r>
+      <w:r>
+        <w:rPr>
+          <w:rFonts w:ascii="Arial" w:eastAsia="Arial" w:hAnsi="Arial" w:cs="Arial"/>
+          <w:sz w:val="16"/>
+          <w:szCs w:val="16"/>
+        </w:rPr>
+        <w:t xml:space="preserve"> |</w:t>
+      </w:r>
+      <w:r>
+        <w:t xml:space="preserve">                                                                                      </w:t>
+      </w:r>
+      <w:r>
+        <w:rPr>
+          <w:rFonts w:ascii="Arial" w:eastAsia="Arial" w:hAnsi="Arial" w:cs="Arial"/>
+          <w:sz w:val="16"/>
+          <w:szCs w:val="16"/>
+        </w:rPr>
+        <w:t xml:space="preserve">                                                   </w:t>
+      </w:r>
+      <w:r>
+        <w:rPr>
+          <w:rFonts w:ascii="Arial" w:eastAsia="Arial" w:hAnsi="Arial" w:cs="Arial"/>
+          <w:sz w:val="16"/>
+          <w:szCs w:val="16"/>
+        </w:rPr>
+        <w:t xml:space="preserve"> </w:t>
+      </w:r>
+      <w:r>
+        <w:rPr>
+          <w:rFonts w:ascii="Arial" w:eastAsia="Arial" w:hAnsi="Arial" w:cs="Arial"/>
+          <w:sz w:val="16"/>
+          <w:szCs w:val="16"/>
+        </w:rPr>
+        <w:t xml:space="preserve">                                        January</w:t>
+      </w:r>
+      <w:r>
+        <w:rPr>
+          <w:rFonts w:ascii="Arial" w:eastAsia="Arial" w:hAnsi="Arial" w:cs="Arial"/>
+          <w:sz w:val="16"/>
+          <w:szCs w:val="16"/>
+        </w:rPr>
+        <w:t xml:space="preserve"> 202</w:t>
+      </w:r>
+      <w:r>
+        <w:rPr>
+          <w:rFonts w:ascii="Arial" w:eastAsia="Arial" w:hAnsi="Arial" w:cs="Arial"/>
+          <w:sz w:val="16"/>
+          <w:szCs w:val="16"/>
+        </w:rPr>
+        <w:t>6</w:t>
+      </w:r>
+      <w:r>
+        <w:rPr>
+          <w:rFonts w:ascii="Arial" w:eastAsia="Arial" w:hAnsi="Arial" w:cs="Arial"/>
+          <w:sz w:val="16"/>
+          <w:szCs w:val="16"/>
+        </w:rPr>
+        <w:t xml:space="preserve"> – </w:t>
+      </w:r>
+      <w:r>
+        <w:rPr>
+          <w:rFonts w:ascii="Arial" w:eastAsia="Arial" w:hAnsi="Arial" w:cs="Arial"/>
+          <w:sz w:val="16"/>
+          <w:szCs w:val="16"/>
+        </w:rPr>
+        <w:t>March</w:t>
+      </w:r>
+      <w:r>
+        <w:rPr>
+          <w:rFonts w:ascii="Arial" w:eastAsia="Arial" w:hAnsi="Arial" w:cs="Arial"/>
+          <w:sz w:val="16"/>
+          <w:szCs w:val="16"/>
+        </w:rPr>
+        <w:t xml:space="preserve"> 2026</w:t>
       </w:r>
     </w:p>
     <w:p>
@@ -2588,7 +2658,43 @@
           <w:sz w:val="16"/>
           <w:szCs w:val="16"/>
         </w:rPr>
-        <w:t>Implemented the frontend using React.js and deployed the application on AWS Amplify to ensure scalability and high availability.</w:t>
+        <w:t xml:space="preserve">Built a </w:t>
+      </w:r>
+      <w:r>
+        <w:rPr>
+          <w:rFonts w:ascii="Arial" w:eastAsia="Arial" w:hAnsi="Arial" w:cs="Arial"/>
+          <w:b/>
+          <w:bCs/>
+          <w:sz w:val="16"/>
+          <w:szCs w:val="16"/>
+        </w:rPr>
+        <w:t>RESTful URL Shortener service</w:t>
+      </w:r>
+      <w:r>
+        <w:rPr>
+          <w:rFonts w:ascii="Arial" w:eastAsia="Arial" w:hAnsi="Arial" w:cs="Arial"/>
+          <w:sz w:val="16"/>
+          <w:szCs w:val="16"/>
+        </w:rPr>
+        <w:t xml:space="preserve"> using </w:t>
+      </w:r>
+      <w:r>
+        <w:rPr>
+          <w:rFonts w:ascii="Arial" w:eastAsia="Arial" w:hAnsi="Arial" w:cs="Arial"/>
+          <w:b/>
+          <w:bCs/>
+          <w:sz w:val="16"/>
+          <w:szCs w:val="16"/>
+        </w:rPr>
+        <w:t>Java and Spring Boot</w:t>
+      </w:r>
+      <w:r>
+        <w:rPr>
+          <w:rFonts w:ascii="Arial" w:eastAsia="Arial" w:hAnsi="Arial" w:cs="Arial"/>
+          <w:sz w:val="16"/>
+          <w:szCs w:val="16"/>
+        </w:rPr>
+        <w:t xml:space="preserve"> to convert long URLs into compact, shareable links.</w:t>
       </w:r>
     </w:p>
     <w:p>
@@ -2614,7 +2720,25 @@
           <w:sz w:val="16"/>
           <w:szCs w:val="16"/>
         </w:rPr>
-        <w:t>Integrated detection logic to analyze URLs and email patterns, helping identify potentially malicious content in real time.</w:t>
+        <w:t xml:space="preserve">Designed and implemented </w:t>
+      </w:r>
+      <w:r>
+        <w:rPr>
+          <w:rFonts w:ascii="Arial" w:eastAsia="Arial" w:hAnsi="Arial" w:cs="Arial"/>
+          <w:b/>
+          <w:bCs/>
+          <w:sz w:val="16"/>
+          <w:szCs w:val="16"/>
+        </w:rPr>
+        <w:t>REST APIs</w:t>
+      </w:r>
+      <w:r>
+        <w:rPr>
+          <w:rFonts w:ascii="Arial" w:eastAsia="Arial" w:hAnsi="Arial" w:cs="Arial"/>
+          <w:sz w:val="16"/>
+          <w:szCs w:val="16"/>
+        </w:rPr>
+        <w:t xml:space="preserve"> for generating short URLs and redirecting users to the original links.</w:t>
       </w:r>
     </w:p>
     <w:p>
@@ -2640,7 +2764,139 @@
           <w:sz w:val="16"/>
           <w:szCs w:val="16"/>
         </w:rPr>
-        <w:t>Focused on building a scalable and user-friendly interface for real-time phishing detection.</w:t>
+        <w:t xml:space="preserve">Integrated </w:t>
+      </w:r>
+      <w:r>
+        <w:rPr>
+          <w:rFonts w:ascii="Arial" w:eastAsia="Arial" w:hAnsi="Arial" w:cs="Arial"/>
+          <w:b/>
+          <w:bCs/>
+          <w:sz w:val="16"/>
+          <w:szCs w:val="16"/>
+        </w:rPr>
+        <w:t>MongoDB</w:t>
+      </w:r>
+      <w:r>
+        <w:rPr>
+          <w:rFonts w:ascii="Arial" w:eastAsia="Arial" w:hAnsi="Arial" w:cs="Arial"/>
+          <w:sz w:val="16"/>
+          <w:szCs w:val="16"/>
+        </w:rPr>
+        <w:t xml:space="preserve"> to store URL mappings, short codes, and related metadata efficiently.</w:t>
+      </w:r>
+    </w:p>
+    <w:p>
+      <w:pPr>
+        <w:numPr>
+          <w:ilvl w:val="1"/>
+          <w:numId w:val="1"/>
+        </w:numPr>
+        <w:tabs>
+          <w:tab w:val="left" w:pos="874"/>
+        </w:tabs>
+        <w:spacing w:before="26" w:line="276" w:lineRule="auto"/>
+        <w:ind w:right="-135"/>
+        <w:rPr>
+          <w:rFonts w:ascii="Arial" w:eastAsia="Arial" w:hAnsi="Arial" w:cs="Arial"/>
+          <w:sz w:val="16"/>
+          <w:szCs w:val="16"/>
+        </w:rPr>
+      </w:pPr>
+      <w:r>
+        <w:rPr>
+          <w:rFonts w:ascii="Arial" w:eastAsia="Arial" w:hAnsi="Arial" w:cs="Arial"/>
+          <w:sz w:val="16"/>
+          <w:szCs w:val="16"/>
+        </w:rPr>
+        <w:t xml:space="preserve">Implemented </w:t>
+      </w:r>
+      <w:r>
+        <w:rPr>
+          <w:rFonts w:ascii="Arial" w:eastAsia="Arial" w:hAnsi="Arial" w:cs="Arial"/>
+          <w:b/>
+          <w:bCs/>
+          <w:sz w:val="16"/>
+          <w:szCs w:val="16"/>
+        </w:rPr>
+        <w:t>unique short code generation and HTTP redirection (302)</w:t>
+      </w:r>
+      <w:r>
+        <w:rPr>
+          <w:rFonts w:ascii="Arial" w:eastAsia="Arial" w:hAnsi="Arial" w:cs="Arial"/>
+          <w:sz w:val="16"/>
+          <w:szCs w:val="16"/>
+        </w:rPr>
+        <w:t xml:space="preserve"> to ensure reliable URL access</w:t>
+      </w:r>
+      <w:r>
+        <w:rPr>
+          <w:rFonts w:ascii="Arial" w:eastAsia="Arial" w:hAnsi="Arial" w:cs="Arial"/>
+          <w:sz w:val="16"/>
+          <w:szCs w:val="16"/>
+        </w:rPr>
+        <w:t>.</w:t>
+      </w:r>
+    </w:p>
+    <w:p>
+      <w:pPr>
+        <w:numPr>
+          <w:ilvl w:val="1"/>
+          <w:numId w:val="1"/>
+        </w:numPr>
+        <w:tabs>
+          <w:tab w:val="left" w:pos="874"/>
+        </w:tabs>
+        <w:spacing w:before="26" w:line="276" w:lineRule="auto"/>
+        <w:ind w:right="-135"/>
+        <w:rPr>
+          <w:rFonts w:ascii="Arial" w:eastAsia="Arial" w:hAnsi="Arial" w:cs="Arial"/>
+          <w:sz w:val="16"/>
+          <w:szCs w:val="16"/>
+        </w:rPr>
+      </w:pPr>
+      <w:r>
+        <w:rPr>
+          <w:rFonts w:ascii="Arial" w:eastAsia="Arial" w:hAnsi="Arial" w:cs="Arial"/>
+          <w:sz w:val="16"/>
+          <w:szCs w:val="16"/>
+        </w:rPr>
+        <w:t xml:space="preserve">Containerized the application using </w:t>
+      </w:r>
+      <w:r>
+        <w:rPr>
+          <w:rFonts w:ascii="Arial" w:eastAsia="Arial" w:hAnsi="Arial" w:cs="Arial"/>
+          <w:b/>
+          <w:bCs/>
+          <w:sz w:val="16"/>
+          <w:szCs w:val="16"/>
+        </w:rPr>
+        <w:t>Docker</w:t>
+      </w:r>
+      <w:r>
+        <w:rPr>
+          <w:rFonts w:ascii="Arial" w:eastAsia="Arial" w:hAnsi="Arial" w:cs="Arial"/>
+          <w:sz w:val="16"/>
+          <w:szCs w:val="16"/>
+        </w:rPr>
+        <w:t xml:space="preserve"> and tested endpoints with </w:t>
+      </w:r>
+      <w:r>
+        <w:rPr>
+          <w:rFonts w:ascii="Arial" w:eastAsia="Arial" w:hAnsi="Arial" w:cs="Arial"/>
+          <w:b/>
+          <w:bCs/>
+          <w:sz w:val="16"/>
+          <w:szCs w:val="16"/>
+        </w:rPr>
+        <w:t>Postman</w:t>
+      </w:r>
+      <w:r>
+        <w:rPr>
+          <w:rFonts w:ascii="Arial" w:eastAsia="Arial" w:hAnsi="Arial" w:cs="Arial"/>
+          <w:sz w:val="16"/>
+          <w:szCs w:val="16"/>
+        </w:rPr>
+        <w:t>, following modular backend architecture practices.</w:t>
       </w:r>
     </w:p>
     <w:p>
@@ -2968,7 +3224,7 @@
           <w:sz w:val="16"/>
           <w:szCs w:val="16"/>
         </w:rPr>
-        <w:t>Gained foundational knowledge of cloud computing concepts, AI services, machine learning basics, and Oracle Cloud Infrastructure core services.</w:t>
+        <w:t>Gained foundational knowledge of cloud computing concepts and Oracle Cloud Infrastructure core services.</w:t>
       </w:r>
     </w:p>
     <w:p>
@@ -3798,7 +4054,6 @@
   <w:style w:type="character" w:default="1" w:styleId="DefaultParagraphFont">
     <w:name w:val="Default Paragraph Font"/>
     <w:uiPriority w:val="1"/>
-    <w:semiHidden/>
     <w:unhideWhenUsed/>
   </w:style>
   <w:style w:type="table" w:default="1" w:styleId="TableNormal">

</xml_diff>